<commit_message>
Dựng lại báo cáo toàn văn theo khung đã chốt (ba chương theo chu trình 4 khâu)
- Chương 1 rút gọn: khái niệm, vai trò; nội dung quản lý theo 4 khâu kèm yêu cầu pháp lý từng khâu
- Chương 2: khái quát Nhà trường; thực trạng theo 4 khâu; đánh giá chung, hạn chế và nguyên nhân theo khâu
- Chương 3: 4 giải pháp theo khâu (vấn đề, việc cần làm, thực hiện, sản phẩm); kế hoạch tổ chức thực hiện
- Thêm Danh mục chữ viết tắt; bỏ bảng tiêu chí, SWOT, các hình không còn dùng; đánh số lại bảng, hình
- Cập nhật báo cáo tóm tắt cho khớp khung mới

Co-Authored-By: Claude Opus 5.5 <noreply@anthropic.com>
Claude-Session: https://claude.ai/code/session_01ThGArqDrUUsqC1zG1BQvVL
</commit_message>
<xml_diff>
--- a/Ban_cuoi/Ban_hoan_thien_03-10-2026/Bao_cao_tom_tat_de_tai.docx
+++ b/Ban_cuoi/Ban_hoan_thien_03-10-2026/Bao_cao_tom_tat_de_tai.docx
@@ -2470,7 +2470,7 @@
           <w:szCs w:val="26"/>
           <w14:ligatures w14:val="none"/>
         </w:rPr>
-        <w:t xml:space="preserve">Về nội dung giải pháp:</w:t>
+        <w:t xml:space="preserve">Về cấu trúc báo cáo:</w:t>
       </w:r>
       <w:r>
         <w:rPr>
@@ -2479,7 +2479,7 @@
           <w:szCs w:val="26"/>
           <w14:ligatures w14:val="none"/>
         </w:rPr>
-        <w:t xml:space="preserve"> giữ ba nhóm giải pháp như thuyết minh, cụ thể hóa thành sáu giải pháp; bổ sung kế hoạch thí điểm, lộ trình và bộ chỉ số theo dõi.</w:t>
+        <w:t xml:space="preserve"> thuyết minh dự kiến Chương 1 gồm cơ sở lý luận, khung pháp lý, tiêu chí và khung phân tích; Chương 3 gồm ba nhóm giải pháp. Để tăng tính ứng dụng, báo cáo trình bày cả ba chương theo bốn khâu sáng tạo, xác lập, khai thác, bảo vệ: yêu cầu pháp lý được nêu ngay trong từng khâu ở Chương 1; Chương 3 gồm bốn giải pháp tương ứng bốn khâu, trong đó các nội dung về quy chế, bộ máy, tài chính và số hóa đã đăng ký vẫn được giữ, kèm kế hoạch tổ chức thực hiện.</w:t>
       </w:r>
     </w:p>
     <w:p>
@@ -2520,7 +2520,7 @@
           <w:szCs w:val="26"/>
           <w14:ligatures w14:val="none"/>
         </w:rPr>
-        <w:t xml:space="preserve"> thuyết minh dự kiến báo cáo 70 - 80 trang; báo cáo toàn văn dài khoảng 67 trang, đáp ứng yêu cầu tối thiểu 30 trang của Trường.</w:t>
+        <w:t xml:space="preserve"> thuyết minh dự kiến báo cáo 70 - 80 trang; báo cáo toàn văn dài khoảng 54 trang, đáp ứng yêu cầu tối thiểu 30 trang của Trường.</w:t>
       </w:r>
     </w:p>
     <w:p>
@@ -2753,7 +2753,7 @@
           <w:szCs w:val="26"/>
           <w14:ligatures w14:val="none"/>
         </w:rPr>
-        <w:t xml:space="preserve"> thứ nhất, hệ thống hóa cơ sở lý luận và pháp lý, xây dựng bộ tiêu chí đánh giá và khung phân tích; thứ hai, đánh giá thực trạng giai đoạn 2021 - 2025, chỉ ra kết quả, hạn chế và nguyên nhân; thứ ba, đề xuất giải pháp kèm lộ trình, kế hoạch thí điểm và bộ chỉ số theo dõi.</w:t>
+        <w:t xml:space="preserve"> thứ nhất, làm rõ nội dung quản lý quyền sở hữu trí tuệ trong trường đại học theo bốn khâu và các yêu cầu pháp lý đối với nhà trường; thứ hai, đánh giá thực trạng giai đoạn 2021 - 2025 theo bốn khâu, chỉ ra kết quả, hạn chế và nguyên nhân; thứ ba, đề xuất giải pháp kèm kế hoạch thực hiện, thí điểm và bộ chỉ số theo dõi.</w:t>
       </w:r>
     </w:p>
     <w:p>
@@ -2799,7 +2799,7 @@
           <w:szCs w:val="26"/>
           <w14:ligatures w14:val="none"/>
         </w:rPr>
-        <w:t xml:space="preserve">Đề tài kết hợp tiếp cận hệ thống, tiếp cận đa bên và nghiên cứu trường hợp tại Trường Đại học Thành Đô. Khung phân tích dựa trên chu trình tạo lập, xác lập, khai thác và bảo vệ, kết hợp bộ 16 tiêu chí theo chuỗi đầu vào, quá trình, đầu ra và kết quả.</w:t>
+        <w:t xml:space="preserve">Đề tài kết hợp tiếp cận hệ thống, tiếp cận đa bên và nghiên cứu trường hợp tại Trường Đại học Thành Đô. Thực trạng và giải pháp được trình bày theo bốn khâu sáng tạo, xác lập, khai thác và bảo vệ.</w:t>
       </w:r>
     </w:p>
     <w:p>
@@ -2821,7 +2821,7 @@
           <w:szCs w:val="26"/>
           <w14:ligatures w14:val="none"/>
         </w:rPr>
-        <w:t xml:space="preserve">Phương pháp phân tích, tổng hợp tài liệu được dùng để hệ thống hóa lý luận và pháp luật. Phương pháp so sánh được dùng để đối chiếu quy chế nội bộ với pháp luật hiện hành và đối chiếu kết quả với Kế hoạch hoạt động khoa học công nghệ giai đoạn 2024 - 2028, gọi tắt là Kế hoạch 07. Nghiên cứu trường hợp dùng dữ liệu hành chính: 582 bản ghi sản phẩm khoa học giai đoạn 2021 - 2025, hồ sơ 38 đề tài cấp cơ sở, danh mục theo dõi đơn và văn bằng, danh sách 252 nhân sự năm 2026. Dữ liệu cá nhân chỉ dùng ở dạng tổng hợp. Kết quả được tổng hợp bằng ma trận điểm mạnh, điểm yếu, cơ hội và thách thức.</w:t>
+        <w:t xml:space="preserve">Phương pháp phân tích, tổng hợp tài liệu được dùng để hệ thống hóa lý luận và pháp luật. Phương pháp so sánh được dùng để đối chiếu quy chế nội bộ với pháp luật hiện hành và đối chiếu kết quả với Kế hoạch hoạt động khoa học công nghệ giai đoạn 2024 - 2028, gọi tắt là Kế hoạch 07. Nghiên cứu trường hợp dùng dữ liệu hành chính: 582 bản ghi sản phẩm khoa học giai đoạn 2021 - 2025, hồ sơ 38 đề tài cấp cơ sở, danh mục theo dõi đơn và văn bằng, danh sách 252 nhân sự năm 2026. Dữ liệu cá nhân chỉ dùng ở dạng tổng hợp.</w:t>
       </w:r>
     </w:p>
     <w:p>
@@ -2891,7 +2891,7 @@
           <w:szCs w:val="26"/>
           <w14:ligatures w14:val="none"/>
         </w:rPr>
-        <w:t xml:space="preserve">4.1. Cơ sở lý luận và yêu cầu của khung pháp lý mới</w:t>
+        <w:t xml:space="preserve">4.1. Nội dung quản lý quyền sở hữu trí tuệ và yêu cầu pháp lý</w:t>
       </w:r>
     </w:p>
     <w:p>
@@ -2913,7 +2913,83 @@
           <w:szCs w:val="26"/>
           <w14:ligatures w14:val="none"/>
         </w:rPr>
-        <w:t xml:space="preserve">Quản lý quyền sở hữu trí tuệ trong trường đại học là quản lý chu trình bốn khâu: tạo lập, xác lập quyền, khai thác và bảo vệ. Nhà trường phải cân bằng giữa phổ biến tri thức và bảo hộ để thu hồi chi phí, tái đầu tư. Đề tài xây dựng bộ 16 tiêu chí đánh giá theo chuỗi và phân biệt bốn khoản lợi ích thường bị nhầm lẫn: thù lao theo Luật Sở hữu trí tuệ, thưởng theo Luật KH,CN&amp;ĐMST, nhuận bút và phần chia nguồn thu.</w:t>
+        <w:t xml:space="preserve">Quản lý quyền sở hữu trí tuệ trong trường đại học là quản lý một chu trình bốn khâu. </w:t>
+      </w:r>
+      <w:r>
+        <w:rPr>
+          <w:b/>
+          <w:rFonts w:eastAsia="Times New Roman" w:cs="Times New Roman"/>
+          <w:kern w:val="0"/>
+          <w:szCs w:val="26"/>
+          <w14:ligatures w14:val="none"/>
+        </w:rPr>
+        <w:t xml:space="preserve">Sáng tạo</w:t>
+      </w:r>
+      <w:r>
+        <w:rPr>
+          <w:rFonts w:eastAsia="Times New Roman" w:cs="Times New Roman"/>
+          <w:kern w:val="0"/>
+          <w:szCs w:val="26"/>
+          <w14:ligatures w14:val="none"/>
+        </w:rPr>
+        <w:t xml:space="preserve">: xác định đối tượng quyền, chủ sở hữu, đồng tác giả ngay khi duyệt đề tài. </w:t>
+      </w:r>
+      <w:r>
+        <w:rPr>
+          <w:b/>
+          <w:rFonts w:eastAsia="Times New Roman" w:cs="Times New Roman"/>
+          <w:kern w:val="0"/>
+          <w:szCs w:val="26"/>
+          <w14:ligatures w14:val="none"/>
+        </w:rPr>
+        <w:t xml:space="preserve">Xác lập</w:t>
+      </w:r>
+      <w:r>
+        <w:rPr>
+          <w:rFonts w:eastAsia="Times New Roman" w:cs="Times New Roman"/>
+          <w:kern w:val="0"/>
+          <w:szCs w:val="26"/>
+          <w14:ligatures w14:val="none"/>
+        </w:rPr>
+        <w:t xml:space="preserve">: khai báo, sàng lọc và nộp đơn trước khi công bố, theo dõi hồ sơ đến khi có văn bằng. </w:t>
+      </w:r>
+      <w:r>
+        <w:rPr>
+          <w:b/>
+          <w:rFonts w:eastAsia="Times New Roman" w:cs="Times New Roman"/>
+          <w:kern w:val="0"/>
+          <w:szCs w:val="26"/>
+          <w14:ligatures w14:val="none"/>
+        </w:rPr>
+        <w:t xml:space="preserve">Khai thác</w:t>
+      </w:r>
+      <w:r>
+        <w:rPr>
+          <w:rFonts w:eastAsia="Times New Roman" w:cs="Times New Roman"/>
+          <w:kern w:val="0"/>
+          <w:szCs w:val="26"/>
+          <w14:ligatures w14:val="none"/>
+        </w:rPr>
+        <w:t xml:space="preserve">: phân chia lợi ích, chuyển giao, cấp phép. </w:t>
+      </w:r>
+      <w:r>
+        <w:rPr>
+          <w:b/>
+          <w:rFonts w:eastAsia="Times New Roman" w:cs="Times New Roman"/>
+          <w:kern w:val="0"/>
+          <w:szCs w:val="26"/>
+          <w14:ligatures w14:val="none"/>
+        </w:rPr>
+        <w:t xml:space="preserve">Bảo vệ</w:t>
+      </w:r>
+      <w:r>
+        <w:rPr>
+          <w:rFonts w:eastAsia="Times New Roman" w:cs="Times New Roman"/>
+          <w:kern w:val="0"/>
+          <w:szCs w:val="26"/>
+          <w14:ligatures w14:val="none"/>
+        </w:rPr>
+        <w:t xml:space="preserve">: bảo mật, liêm chính học thuật, duy trì văn bằng, xử lý xâm phạm.</w:t>
       </w:r>
     </w:p>
     <w:p>
@@ -2935,7 +3011,7 @@
           <w:szCs w:val="26"/>
           <w14:ligatures w14:val="none"/>
         </w:rPr>
-        <w:t xml:space="preserve">Khung pháp lý mới có hai thay đổi lớn. Thứ nhất, quyền quyết định chuyển về nhà trường: tổ chức chủ trì tự động có quyền sở hữu phần kết quả dùng ngân sách, có quyền đăng ký sáng chế, kiểu dáng, thiết kế bố trí và tự quyết cách thương mại hóa. Thứ hai, đi kèm quyền là nghĩa vụ: thưởng tối thiểu cho tác giả, ghi nhận mức đóng góp, theo dõi riêng kết quả từ ngân sách, công khai kết quả và đáp ứng Chuẩn cơ sở giáo dục đại học. Quy chế nội bộ vì vậy phải xác định lợi ích theo nguồn kinh phí, thời điểm giao nhiệm vụ và loại đối tượng.</w:t>
+        <w:t xml:space="preserve">Khung pháp lý 2025 - 2026 đặt yêu cầu cụ thể cho từng khâu: tổ chức chủ trì tự động có quyền sở hữu phần kết quả dùng ngân sách và phải theo dõi riêng; có quyền đăng ký sáng chế, kiểu dáng, thiết kế bố trí; tác giả được thưởng tối thiểu 30% lợi nhuận sau thuế với phần dùng ngân sách, tách biệt với thù lao; đồng tác giả chia thưởng theo thỏa thuận; cơ sở giáo dục đại học phải có quy chế về liêm chính học thuật theo Thông tư 83.</w:t>
       </w:r>
     </w:p>
     <w:p>
@@ -3511,7 +3587,7 @@
                 <w:szCs w:val="26"/>
                 <w14:ligatures w14:val="none"/>
               </w:rPr>
-              <w:t xml:space="preserve">Dữ liệu quản lý</w:t>
+              <w:t xml:space="preserve">Theo dõi hồ sơ</w:t>
             </w:r>
           </w:p>
         </w:tc>
@@ -3542,7 +3618,7 @@
                 <w:szCs w:val="26"/>
                 <w14:ligatures w14:val="none"/>
               </w:rPr>
-              <w:t xml:space="preserve">Trong 16 tiêu chí, 4 tiêu chí tính được đầy đủ, 5 tính được một phần, 7 chưa tính được</w:t>
+              <w:t xml:space="preserve">Chưa có danh mục tài sản trí tuệ; hai bảng theo dõi ghi lệch trạng thái 5 kiểu dáng; danh mục bài báo không ghi mã đề tài</w:t>
             </w:r>
           </w:p>
         </w:tc>
@@ -3649,22 +3725,12 @@
       </w:pPr>
       <w:r>
         <w:rPr>
-          <w:b/>
-          <w:rFonts w:eastAsia="Times New Roman" w:cs="Times New Roman"/>
-          <w:kern w:val="0"/>
-          <w:szCs w:val="26"/>
-          <w14:ligatures w14:val="none"/>
-        </w:rPr>
-        <w:t xml:space="preserve">Về thể chế</w:t>
-      </w:r>
-      <w:r>
-        <w:rPr>
-          <w:rFonts w:eastAsia="Times New Roman" w:cs="Times New Roman"/>
-          <w:kern w:val="0"/>
-          <w:szCs w:val="26"/>
-          <w14:ligatures w14:val="none"/>
-        </w:rPr>
-        <w:t xml:space="preserve">, Nhà trường có tầm nhìn sớm: Quyết định 213 đã có chương riêng về sở hữu trí tuệ, Quyết định 217 là quy chế chuyên biệt, cả hai ra đời trước các luật mới. Tuy vậy, các quy định nội bộ về lợi ích của tác giả ban hành ở những thời điểm khác nhau, chưa rõ thứ tự áp dụng và chưa phân biệt thưởng với thù lao. Mức trần 100 triệu đồng cho phần khen thưởng tác giả cần rà soát với các trường hợp thuộc phạm vi Luật KH,CN&amp;ĐMST; ba đề tài cấp quốc gia không cùng một chế độ do quy định chuyển tiếp.</w:t>
+          <w:rFonts w:eastAsia="Times New Roman" w:cs="Times New Roman"/>
+          <w:kern w:val="0"/>
+          <w:szCs w:val="26"/>
+          <w14:ligatures w14:val="none"/>
+        </w:rPr>
+        <w:t xml:space="preserve">Nhà trường có tầm nhìn thể chế sớm: Quyết định 213 năm 2021 đã có chương riêng về sở hữu trí tuệ, Quyết định 217 năm 2024 là quy chế chuyên biệt. Xét theo bốn khâu, hạn chế và nguyên nhân như sau:</w:t>
       </w:r>
     </w:p>
     <w:p>
@@ -3681,22 +3747,31 @@
       </w:pPr>
       <w:r>
         <w:rPr>
-          <w:b/>
-          <w:rFonts w:eastAsia="Times New Roman" w:cs="Times New Roman"/>
-          <w:kern w:val="0"/>
-          <w:szCs w:val="26"/>
-          <w14:ligatures w14:val="none"/>
-        </w:rPr>
-        <w:t xml:space="preserve">Về tổ chức, nguồn lực và dữ liệu</w:t>
+          <w:rFonts w:eastAsia="Times New Roman" w:cs="Times New Roman"/>
+          <w:kern w:val="0"/>
+          <w:szCs w:val="26"/>
+          <w14:ligatures w14:val="none"/>
+        </w:rPr>
+        <w:t xml:space="preserve">- </w:t>
       </w:r>
       <w:r>
         <w:rPr>
-          <w:rFonts w:eastAsia="Times New Roman" w:cs="Times New Roman"/>
-          <w:kern w:val="0"/>
-          <w:szCs w:val="26"/>
-          <w14:ligatures w14:val="none"/>
-        </w:rPr>
-        <w:t xml:space="preserve">, công việc chia cho bốn đơn vị nhưng chưa có luồng hồ sơ liên thông. Quy chế đã có căn cứ chi lệ phí, thuê ngoài nhưng chưa có dự toán riêng, cách tạm ứng và người đề xuất chi cho bước đăng ký. Cơ chế khuyến khích năm 2026 thưởng bài báo ngay khi đăng nhưng chỉ ghi nhận văn bằng khi được cấp. Chưa có danh mục tài sản trí tuệ liên kết với danh mục đề tài.</w:t>
+          <w:b/>
+          <w:rFonts w:eastAsia="Times New Roman" w:cs="Times New Roman"/>
+          <w:kern w:val="0"/>
+          <w:szCs w:val="26"/>
+          <w14:ligatures w14:val="none"/>
+        </w:rPr>
+        <w:t xml:space="preserve">Sáng tạo:</w:t>
+      </w:r>
+      <w:r>
+        <w:rPr>
+          <w:rFonts w:eastAsia="Times New Roman" w:cs="Times New Roman"/>
+          <w:kern w:val="0"/>
+          <w:szCs w:val="26"/>
+          <w14:ligatures w14:val="none"/>
+        </w:rPr>
+        <w:t xml:space="preserve"> kết quả nghiên cứu chủ yếu là bài báo; quyền sở hữu, đồng tác giả chưa được xác định từ lúc duyệt đề tài; chưa có tập huấn riêng về sở hữu trí tuệ, 87 giáo trình chưa đăng ký quyền tác giả.</w:t>
       </w:r>
     </w:p>
     <w:p>
@@ -3713,22 +3788,31 @@
       </w:pPr>
       <w:r>
         <w:rPr>
-          <w:b/>
-          <w:rFonts w:eastAsia="Times New Roman" w:cs="Times New Roman"/>
-          <w:kern w:val="0"/>
-          <w:szCs w:val="26"/>
-          <w14:ligatures w14:val="none"/>
-        </w:rPr>
-        <w:t xml:space="preserve">Về nhận thức</w:t>
+          <w:rFonts w:eastAsia="Times New Roman" w:cs="Times New Roman"/>
+          <w:kern w:val="0"/>
+          <w:szCs w:val="26"/>
+          <w14:ligatures w14:val="none"/>
+        </w:rPr>
+        <w:t xml:space="preserve">- </w:t>
       </w:r>
       <w:r>
         <w:rPr>
-          <w:rFonts w:eastAsia="Times New Roman" w:cs="Times New Roman"/>
-          <w:kern w:val="0"/>
-          <w:szCs w:val="26"/>
-          <w14:ligatures w14:val="none"/>
-        </w:rPr>
-        <w:t xml:space="preserve">, đề tài không khảo sát trực tiếp. Các dữ kiện hành vi cho thấy kỹ năng nhận diện và bảo hộ còn hạn chế: sản phẩm tiềm năng chưa có đơn, 87 giáo trình chưa đăng ký quyền tác giả, chưa có tập huấn riêng về sở hữu trí tuệ. Ngược lại, đơn sáng chế từ đề tài chiết xuất lá Quế hoa và 5 kiểu dáng hợp tác doanh nghiệp cho thấy một nhóm giảng viên đã có ý thức bảo hộ.</w:t>
+          <w:b/>
+          <w:rFonts w:eastAsia="Times New Roman" w:cs="Times New Roman"/>
+          <w:kern w:val="0"/>
+          <w:szCs w:val="26"/>
+          <w14:ligatures w14:val="none"/>
+        </w:rPr>
+        <w:t xml:space="preserve">Xác lập:</w:t>
+      </w:r>
+      <w:r>
+        <w:rPr>
+          <w:rFonts w:eastAsia="Times New Roman" w:cs="Times New Roman"/>
+          <w:kern w:val="0"/>
+          <w:szCs w:val="26"/>
+          <w14:ligatures w14:val="none"/>
+        </w:rPr>
+        <w:t xml:space="preserve"> đây là hạn chế lớn nhất: mới 1 trên 9 đề tài có sản phẩm tiềm năng sở hữu công nghiệp có đơn. Nguyên nhân có thể là chưa có bước sàng lọc trước khi công bố, chưa có dự toán và người đề xuất chi cho bước đăng ký, đầu mối kiêm nhiệm, chưa có công cụ theo dõi hồ sơ; cơ chế khuyến khích năm 2026 thưởng bài báo ngay khi đăng nhưng chỉ ghi nhận văn bằng khi được cấp.</w:t>
       </w:r>
     </w:p>
     <w:p>
@@ -3750,7 +3834,89 @@
           <w:szCs w:val="26"/>
           <w14:ligatures w14:val="none"/>
         </w:rPr>
-        <w:t xml:space="preserve">Đề tài xác định bảy hạn chế, nổi bật là kết quả nghiên cứu chưa được chuyển thành quyền tương xứng với tiềm năng. Nguyên nhân khách quan gồm pháp luật thay đổi nhanh, thủ tục dài và tốn chi phí, cơ cấu ngành thiên về khoa học xã hội. Về chủ quan, giả thuyết của đề tài là điểm nghẽn nằm ở khâu từ kết quả nghiên cứu đến đơn đăng ký: chưa có bước sàng lọc khả năng bảo hộ trước khi công bố, chưa có dự toán cho bước đăng ký, quy định lợi ích chưa thống nhất và dữ liệu chưa liên thông.</w:t>
+        <w:t xml:space="preserve">- </w:t>
+      </w:r>
+      <w:r>
+        <w:rPr>
+          <w:b/>
+          <w:rFonts w:eastAsia="Times New Roman" w:cs="Times New Roman"/>
+          <w:kern w:val="0"/>
+          <w:szCs w:val="26"/>
+          <w14:ligatures w14:val="none"/>
+        </w:rPr>
+        <w:t xml:space="preserve">Khai thác:</w:t>
+      </w:r>
+      <w:r>
+        <w:rPr>
+          <w:rFonts w:eastAsia="Times New Roman" w:cs="Times New Roman"/>
+          <w:kern w:val="0"/>
+          <w:szCs w:val="26"/>
+          <w14:ligatures w14:val="none"/>
+        </w:rPr>
+        <w:t xml:space="preserve"> mới có hai hợp đồng chuyển giao quyền sử dụng tác phẩm; quy định nội bộ về lợi ích của tác giả chưa rõ thứ tự áp dụng, chưa phân biệt thưởng với thù lao; mức trần 100 triệu đồng cần rà soát theo Luật KH,CN&amp;ĐMST.</w:t>
+      </w:r>
+    </w:p>
+    <w:p>
+      <w:pPr>
+        <w:spacing w:line="360" w:lineRule="auto"/>
+        <w:ind w:right="140" w:firstLine="567"/>
+        <w:jc w:val="both"/>
+        <w:rPr>
+          <w:rFonts w:eastAsia="Times New Roman" w:cs="Times New Roman"/>
+          <w:kern w:val="0"/>
+          <w:szCs w:val="26"/>
+          <w14:ligatures w14:val="none"/>
+        </w:rPr>
+      </w:pPr>
+      <w:r>
+        <w:rPr>
+          <w:rFonts w:eastAsia="Times New Roman" w:cs="Times New Roman"/>
+          <w:kern w:val="0"/>
+          <w:szCs w:val="26"/>
+          <w14:ligatures w14:val="none"/>
+        </w:rPr>
+        <w:t xml:space="preserve">- </w:t>
+      </w:r>
+      <w:r>
+        <w:rPr>
+          <w:b/>
+          <w:rFonts w:eastAsia="Times New Roman" w:cs="Times New Roman"/>
+          <w:kern w:val="0"/>
+          <w:szCs w:val="26"/>
+          <w14:ligatures w14:val="none"/>
+        </w:rPr>
+        <w:t xml:space="preserve">Bảo vệ:</w:t>
+      </w:r>
+      <w:r>
+        <w:rPr>
+          <w:rFonts w:eastAsia="Times New Roman" w:cs="Times New Roman"/>
+          <w:kern w:val="0"/>
+          <w:szCs w:val="26"/>
+          <w14:ligatures w14:val="none"/>
+        </w:rPr>
+        <w:t xml:space="preserve"> chưa có cơ chế theo dõi xâm phạm, sổ theo dõi hiệu lực văn bằng, quy định về kiểm tra trùng lặp và dùng trí tuệ nhân tạo.</w:t>
+      </w:r>
+    </w:p>
+    <w:p>
+      <w:pPr>
+        <w:spacing w:line="360" w:lineRule="auto"/>
+        <w:ind w:right="140" w:firstLine="567"/>
+        <w:jc w:val="both"/>
+        <w:rPr>
+          <w:rFonts w:eastAsia="Times New Roman" w:cs="Times New Roman"/>
+          <w:kern w:val="0"/>
+          <w:szCs w:val="26"/>
+          <w14:ligatures w14:val="none"/>
+        </w:rPr>
+      </w:pPr>
+      <w:r>
+        <w:rPr>
+          <w:rFonts w:eastAsia="Times New Roman" w:cs="Times New Roman"/>
+          <w:kern w:val="0"/>
+          <w:szCs w:val="26"/>
+          <w14:ligatures w14:val="none"/>
+        </w:rPr>
+        <w:t xml:space="preserve">Nguyên nhân khách quan gồm pháp luật thay đổi nhanh, thủ tục dài và tốn chi phí, cơ cấu ngành thiên về khoa học xã hội. Các nguyên nhân chủ quan là giả thuyết, cần được kiểm chứng qua thí điểm.</w:t>
       </w:r>
     </w:p>
     <w:p>
@@ -3796,7 +3962,7 @@
           <w:szCs w:val="26"/>
           <w14:ligatures w14:val="none"/>
         </w:rPr>
-        <w:t xml:space="preserve">Đề tài đề xuất sáu giải pháp, xếp thành ba nhóm như đã đăng ký trong thuyết minh (Bảng 2).</w:t>
+        <w:t xml:space="preserve">Đề tài đề xuất bốn giải pháp tương ứng bốn khâu (Bảng 2).</w:t>
       </w:r>
     </w:p>
     <w:p>
@@ -3820,7 +3986,7 @@
           <w:szCs w:val="26"/>
           <w14:ligatures w14:val="none"/>
         </w:rPr>
-        <w:t xml:space="preserve">Bảng 2. Hệ thống giải pháp nâng cao hiệu quả quản lý quyền sở hữu trí tuệ tại Trường Đại học Thành Đô</w:t>
+        <w:t xml:space="preserve">Bảng 2. Giải pháp nâng cao hiệu quả quản lý quyền sở hữu trí tuệ tại Trường Đại học Thành Đô</w:t>
       </w:r>
     </w:p>
     <w:tbl>
@@ -3875,7 +4041,7 @@
                 <w:szCs w:val="26"/>
                 <w14:ligatures w14:val="none"/>
               </w:rPr>
-              <w:t xml:space="preserve">Nhóm</w:t>
+              <w:t xml:space="preserve">Giải pháp</w:t>
             </w:r>
           </w:p>
         </w:tc>
@@ -3909,7 +4075,7 @@
                 <w:szCs w:val="26"/>
                 <w14:ligatures w14:val="none"/>
               </w:rPr>
-              <w:t xml:space="preserve">Giải pháp và nội dung chính</w:t>
+              <w:t xml:space="preserve">Việc cần làm chính</w:t>
             </w:r>
           </w:p>
         </w:tc>
@@ -3942,7 +4108,7 @@
                 <w:szCs w:val="26"/>
                 <w14:ligatures w14:val="none"/>
               </w:rPr>
-              <w:t xml:space="preserve">Hoàn thiện thể chế, quy chế nội bộ và bộ máy</w:t>
+              <w:t xml:space="preserve">Nâng cao hiệu quả sáng tạo và nhận diện tài sản trí tuệ</w:t>
             </w:r>
           </w:p>
         </w:tc>
@@ -3968,53 +4134,12 @@
             </w:pPr>
             <w:r>
               <w:rPr>
-                <w:b/>
-                <w:rFonts w:eastAsia="Times New Roman" w:cs="Times New Roman"/>
-                <w:kern w:val="0"/>
-                <w:szCs w:val="26"/>
-                <w14:ligatures w14:val="none"/>
-              </w:rPr>
-              <w:t xml:space="preserve">Giải pháp 1.</w:t>
-            </w:r>
-            <w:r>
-              <w:rPr>
-                <w:rFonts w:eastAsia="Times New Roman" w:cs="Times New Roman"/>
-                <w:kern w:val="0"/>
-                <w:szCs w:val="26"/>
-                <w14:ligatures w14:val="none"/>
-              </w:rPr>
-              <w:t xml:space="preserve"> Sửa Quy chế quản trị tài sản trí tuệ trên nền Quyết định 217, hợp nhất quy định của Quyết định 213; lợi ích của tác giả theo ba lớp: nghĩa vụ theo luật, phần Nhà trường tự quyết, nhuận bút; mẫu thỏa thuận chia thưởng giữa đồng tác giả. Ban hành trước 31/5/2027.</w:t>
-            </w:r>
-          </w:p>
-        </w:tc>
-        <w:tc>
-          <w:tcPr>
-            <w:tcW w:w="2457" w:type="dxa"/>
-            <w:tcMar>
-              <w:left w:w="28" w:type="dxa"/>
-              <w:right w:w="28" w:type="dxa"/>
-            </w:tcMar>
-          </w:tcPr>
-          <w:p>
-            <w:pPr>
-              <w:spacing w:line="360" w:lineRule="auto"/>
-              <w:ind w:right="140" w:firstLine="0"/>
-              <w:jc w:val="left"/>
-              <w:rPr>
-                <w:rFonts w:eastAsia="Times New Roman" w:cs="Times New Roman"/>
-                <w:kern w:val="0"/>
-                <w:szCs w:val="26"/>
-                <w14:ligatures w14:val="none"/>
-              </w:rPr>
-            </w:pPr>
-            <w:r>
-              <w:rPr>
-                <w:rFonts w:eastAsia="Times New Roman" w:cs="Times New Roman"/>
-                <w:kern w:val="0"/>
-                <w:szCs w:val="26"/>
-                <w14:ligatures w14:val="none"/>
-              </w:rPr>
-              <w:t xml:space="preserve">Viện Quản trị và Công nghệ</w:t>
+                <w:rFonts w:eastAsia="Times New Roman" w:cs="Times New Roman"/>
+                <w:kern w:val="0"/>
+                <w:szCs w:val="26"/>
+                <w14:ligatures w14:val="none"/>
+              </w:rPr>
+              <w:t xml:space="preserve">Xác định đối tượng quyền, chủ thể quyền, đồng tác giả ngay khi duyệt đề tài; ưu tiên đề tài có sản phẩm bảo hộ được, nhất là lĩnh vực dược; ghi nhận một nửa định mức giờ khi đơn được chấp nhận hợp lệ; tập huấn bắt buộc cho giảng viên mới, học phần sở hữu trí tuệ.</w:t>
             </w:r>
           </w:p>
         </w:tc>
@@ -4047,7 +4172,7 @@
                 <w:szCs w:val="26"/>
                 <w14:ligatures w14:val="none"/>
               </w:rPr>
-              <w:t xml:space="preserve">Chuẩn hóa quy trình và số hóa công tác quản lý</w:t>
+              <w:t xml:space="preserve">Sàng lọc và hỗ trợ xác lập quyền</w:t>
             </w:r>
           </w:p>
         </w:tc>
@@ -4073,53 +4198,12 @@
             </w:pPr>
             <w:r>
               <w:rPr>
-                <w:b/>
-                <w:rFonts w:eastAsia="Times New Roman" w:cs="Times New Roman"/>
-                <w:kern w:val="0"/>
-                <w:szCs w:val="26"/>
-                <w14:ligatures w14:val="none"/>
-              </w:rPr>
-              <w:t xml:space="preserve">Giải pháp 3.</w:t>
-            </w:r>
-            <w:r>
-              <w:rPr>
-                <w:rFonts w:eastAsia="Times New Roman" w:cs="Times New Roman"/>
-                <w:kern w:val="0"/>
-                <w:szCs w:val="26"/>
-                <w14:ligatures w14:val="none"/>
-              </w:rPr>
-              <w:t xml:space="preserve"> Quy trình 8 khâu từ khai báo đến khai thác; sàng lọc và xem xét bảo mật trước khi công bố; luồng nộp đơn sớm không chờ nghiệm thu; phiếu rà soát tại nghiệm thu.</w:t>
-            </w:r>
-          </w:p>
-        </w:tc>
-        <w:tc>
-          <w:tcPr>
-            <w:tcW w:w="2457" w:type="dxa"/>
-            <w:tcMar>
-              <w:left w:w="28" w:type="dxa"/>
-              <w:right w:w="28" w:type="dxa"/>
-            </w:tcMar>
-          </w:tcPr>
-          <w:p>
-            <w:pPr>
-              <w:spacing w:line="360" w:lineRule="auto"/>
-              <w:ind w:right="140" w:firstLine="0"/>
-              <w:jc w:val="left"/>
-              <w:rPr>
-                <w:rFonts w:eastAsia="Times New Roman" w:cs="Times New Roman"/>
-                <w:kern w:val="0"/>
-                <w:szCs w:val="26"/>
-                <w14:ligatures w14:val="none"/>
-              </w:rPr>
-            </w:pPr>
-            <w:r>
-              <w:rPr>
-                <w:rFonts w:eastAsia="Times New Roman" w:cs="Times New Roman"/>
-                <w:kern w:val="0"/>
-                <w:szCs w:val="26"/>
-                <w14:ligatures w14:val="none"/>
-              </w:rPr>
-              <w:t xml:space="preserve">Viện Quản trị và Công nghệ</w:t>
+                <w:rFonts w:eastAsia="Times New Roman" w:cs="Times New Roman"/>
+                <w:kern w:val="0"/>
+                <w:szCs w:val="26"/>
+                <w14:ligatures w14:val="none"/>
+              </w:rPr>
+              <w:t xml:space="preserve">Quy trình 8 khâu với luồng nộp đơn sớm không chờ nghiệm thu và phiếu rà soát tại nghiệm thu; dòng dự toán phí xác lập quyền; giao đầu mối kiêm nhiệm, quy chế phối hợp; danh mục số tài sản trí tuệ; rà soát ngay các hồ sơ tồn đọng.</w:t>
             </w:r>
           </w:p>
         </w:tc>
@@ -4152,7 +4236,7 @@
                 <w:szCs w:val="26"/>
                 <w14:ligatures w14:val="none"/>
               </w:rPr>
-              <w:t xml:space="preserve">Thúc đẩy thương mại hóa và nâng cao nhận thức</w:t>
+              <w:t xml:space="preserve">Thúc đẩy khai thác quyền</w:t>
             </w:r>
           </w:p>
         </w:tc>
@@ -4178,28 +4262,20 @@
             </w:pPr>
             <w:r>
               <w:rPr>
-                <w:b/>
-                <w:rFonts w:eastAsia="Times New Roman" w:cs="Times New Roman"/>
-                <w:kern w:val="0"/>
-                <w:szCs w:val="26"/>
-                <w14:ligatures w14:val="none"/>
-              </w:rPr>
-              <w:t xml:space="preserve">Giải pháp 5.</w:t>
-            </w:r>
-            <w:r>
-              <w:rPr>
-                <w:rFonts w:eastAsia="Times New Roman" w:cs="Times New Roman"/>
-                <w:kern w:val="0"/>
-                <w:szCs w:val="26"/>
-                <w14:ligatures w14:val="none"/>
-              </w:rPr>
-              <w:t xml:space="preserve"> Dòng dự toán hằng năm cho phí xác lập quyền; ghi nhận một nửa định mức khi đơn được chấp nhận hợp lệ; khai thác qua tư vấn thuê ngoài, doanh nghiệp quản lý tài sản trí tuệ chỉ lập khi đủ điều kiện.</w:t>
-            </w:r>
-          </w:p>
-        </w:tc>
-        <w:tc>
-          <w:tcPr>
-            <w:tcW w:w="2457" w:type="dxa"/>
+                <w:rFonts w:eastAsia="Times New Roman" w:cs="Times New Roman"/>
+                <w:kern w:val="0"/>
+                <w:szCs w:val="26"/>
+                <w14:ligatures w14:val="none"/>
+              </w:rPr>
+              <w:t xml:space="preserve">Quy định lợi ích của tác giả theo ba lớp; mẫu thỏa thuận chia thưởng giữa đồng tác giả; khai thác qua tư vấn thuê ngoài, doanh nghiệp quản lý tài sản trí tuệ chỉ lập khi đủ điều kiện; chuẩn bị tham gia thí điểm định giá.</w:t>
+            </w:r>
+          </w:p>
+        </w:tc>
+      </w:tr>
+      <w:tr>
+        <w:tc>
+          <w:tcPr>
+            <w:tcW w:w="2600" w:type="dxa"/>
             <w:tcMar>
               <w:left w:w="28" w:type="dxa"/>
               <w:right w:w="28" w:type="dxa"/>
@@ -4224,7 +4300,38 @@
                 <w:szCs w:val="26"/>
                 <w14:ligatures w14:val="none"/>
               </w:rPr>
-              <w:t xml:space="preserve">Viện Quản trị và Công nghệ</w:t>
+              <w:t xml:space="preserve">Tăng cường bảo vệ quyền</w:t>
+            </w:r>
+          </w:p>
+        </w:tc>
+        <w:tc>
+          <w:tcPr>
+            <w:tcW w:w="6400" w:type="dxa"/>
+            <w:tcMar>
+              <w:left w:w="28" w:type="dxa"/>
+              <w:right w:w="28" w:type="dxa"/>
+            </w:tcMar>
+          </w:tcPr>
+          <w:p>
+            <w:pPr>
+              <w:spacing w:line="360" w:lineRule="auto"/>
+              <w:ind w:right="140" w:firstLine="0"/>
+              <w:jc w:val="left"/>
+              <w:rPr>
+                <w:rFonts w:eastAsia="Times New Roman" w:cs="Times New Roman"/>
+                <w:kern w:val="0"/>
+                <w:szCs w:val="26"/>
+                <w14:ligatures w14:val="none"/>
+              </w:rPr>
+            </w:pPr>
+            <w:r>
+              <w:rPr>
+                <w:rFonts w:eastAsia="Times New Roman" w:cs="Times New Roman"/>
+                <w:kern w:val="0"/>
+                <w:szCs w:val="26"/>
+                <w14:ligatures w14:val="none"/>
+              </w:rPr>
+              <w:t xml:space="preserve">Bảo mật trước khi công bố, cam kết bảo mật; quy định kiểm tra trùng lặp và dùng trí tuệ nhân tạo; lịch duy trì văn bằng; đầu mối xử lý xâm phạm; quản lý nhãn hiệu hệ sinh thái.</w:t>
             </w:r>
           </w:p>
         </w:tc>
@@ -4251,6 +4358,28 @@
           <w14:ligatures w14:val="none"/>
         </w:rPr>
         <w:t xml:space="preserve">Nguồn: Nhóm nghiên cứu đề xuất.</w:t>
+      </w:r>
+    </w:p>
+    <w:p>
+      <w:pPr>
+        <w:spacing w:line="360" w:lineRule="auto"/>
+        <w:ind w:right="140" w:firstLine="567"/>
+        <w:jc w:val="both"/>
+        <w:rPr>
+          <w:rFonts w:eastAsia="Times New Roman" w:cs="Times New Roman"/>
+          <w:kern w:val="0"/>
+          <w:szCs w:val="26"/>
+          <w14:ligatures w14:val="none"/>
+        </w:rPr>
+      </w:pPr>
+      <w:r>
+        <w:rPr>
+          <w:rFonts w:eastAsia="Times New Roman" w:cs="Times New Roman"/>
+          <w:kern w:val="0"/>
+          <w:szCs w:val="26"/>
+          <w14:ligatures w14:val="none"/>
+        </w:rPr>
+        <w:t xml:space="preserve">Các giải pháp được thể chế hóa trong Quy chế quản trị tài sản trí tuệ sửa đổi, ban hành trước ngày 31 tháng 5 năm 2027.</w:t>
       </w:r>
     </w:p>
     <w:p>
@@ -4409,7 +4538,7 @@
           <w:szCs w:val="26"/>
           <w14:ligatures w14:val="none"/>
         </w:rPr>
-        <w:t xml:space="preserve">- Hệ thống hóa cơ sở lý luận, khung pháp lý 2025 - 2026; xây dựng bộ 16 tiêu chí và khung phân tích.</w:t>
+        <w:t xml:space="preserve">- Làm rõ nội dung quản lý quyền sở hữu trí tuệ theo bốn khâu và yêu cầu pháp lý 2025 - 2026 cho từng khâu.</w:t>
       </w:r>
     </w:p>
     <w:p>
@@ -4453,7 +4582,7 @@
           <w:szCs w:val="26"/>
           <w14:ligatures w14:val="none"/>
         </w:rPr>
-        <w:t xml:space="preserve">- Chỉ ra bảy hạn chế, ba nguyên nhân khách quan và các giả thuyết về nguyên nhân chủ quan.</w:t>
+        <w:t xml:space="preserve">- Chỉ ra hạn chế và nguyên nhân theo từng khâu; hạn chế lớn nhất nằm ở khâu xác lập.</w:t>
       </w:r>
     </w:p>
     <w:p>
@@ -4475,7 +4604,7 @@
           <w:szCs w:val="26"/>
           <w14:ligatures w14:val="none"/>
         </w:rPr>
-        <w:t xml:space="preserve">- Đề xuất sáu giải pháp thuộc ba nhóm, trọng tâm là quy trình 8 khâu với sàng lọc trước khi công bố và luồng nộp đơn sớm.</w:t>
+        <w:t xml:space="preserve">- Đề xuất bốn giải pháp theo bốn khâu, trọng tâm là quy trình 8 khâu với sàng lọc trước khi công bố và luồng nộp đơn sớm.</w:t>
       </w:r>
     </w:p>
     <w:p>

</xml_diff>